<commit_message>
Tambahkan PDF Modul 1 sisken dan perbaiki identitas Getaran di docx-nya
Tombol unduh PDF di Modul 1 sisken menunjuk
Modul-Word/Modul-1-Pengantar-Sistem-Kontrol-Cerdas.pdf yang belum pernah ada,
jadi tombolnya mengunduh 404. PDF sekarang dibuat dari docx-nya (18 halaman).

Sekalian memperbaiki sisa identitas dokumen sumber: skrip pembangun docx dulu
hanya mengganti teks di word/document.xml, sehingga header setiap halaman masih
berbunyi "Dedik Romahadi, ST., M.Sc | Getaran Mekanik" dan satu hyperlink masih
menunjuk halaman modul Getaran. Keduanya kini mengikuti konvensi matkul lain
(Optimalisasi & Otomasi memakai nama mata kuliahnya sendiri).

Diperiksa dengan merender PDF: header benar di semua halaman, gambar
proporsional tanpa regangan, ukuran teks gambar seimbang dengan paragraf.

Co-Authored-By: Claude Opus 5 <noreply@anthropic.com>
</commit_message>
<xml_diff>
--- a/Sistem-Kendali-Cerdas/Modul-Word/Modul-1-Pengantar-Sistem-Kontrol-Cerdas.docx
+++ b/Sistem-Kendali-Cerdas/Modul-Word/Modul-1-Pengantar-Sistem-Kontrol-Cerdas.docx
@@ -10096,7 +10096,7 @@
                               <w:noProof/>
                               <w:lang w:val="fi-FI"/>
                             </w:rPr>
-                            <w:t>Dedik Romahadi, ST., M.Sc | Getaran Mekanik</w:t>
+                            <w:t>Dedik Romahadi, ST., M.Sc | Sistem Kendali Cerdas</w:t>
                           </w:r>
                           <w:r>
                             <w:rPr>
@@ -10151,7 +10151,7 @@
                         <w:noProof/>
                         <w:lang w:val="fi-FI"/>
                       </w:rPr>
-                      <w:t>Dedik Romahadi, ST., M.Sc | Getaran Mekanik</w:t>
+                      <w:t>Dedik Romahadi, ST., M.Sc | Sistem Kendali Cerdas</w:t>
                     </w:r>
                     <w:r>
                       <w:rPr>

</xml_diff>